<commit_message>
Docs - Update GMS
Version 26.0810.0001
</commit_message>
<xml_diff>
--- a/Documents/GMS.26.0803.0001.docx
+++ b/Documents/GMS.26.0803.0001.docx
@@ -162,15 +162,7 @@
                 <w:sz w:val="16"/>
                 <w:szCs w:val="16"/>
               </w:rPr>
-              <w:t xml:space="preserve">/ </w:t>
-            </w:r>
-            <w:r>
-              <w:rPr>
-                <w:color w:val="525252" w:themeColor="accent3" w:themeShade="80"/>
-                <w:sz w:val="16"/>
-                <w:szCs w:val="16"/>
-              </w:rPr>
-              <w:t>Draft / Reviewed / Approved</w:t>
+              <w:t>/ Draft / Reviewed / Approved</w:t>
             </w:r>
           </w:p>
         </w:tc>
@@ -255,8 +247,8 @@
           <w:rFonts w:cstheme="minorHAnsi"/>
         </w:rPr>
       </w:pPr>
-      <w:bookmarkStart w:id="0" w:name="_Toc236682391"/>
-      <w:bookmarkStart w:id="1" w:name="_Toc236682442"/>
+      <w:bookmarkStart w:id="0" w:name="_Toc236682442"/>
+      <w:bookmarkStart w:id="1" w:name="_Toc236682391"/>
       <w:r>
         <w:rPr>
           <w:rFonts w:cstheme="minorHAnsi"/>
@@ -264,7 +256,7 @@
         <w:lastRenderedPageBreak/>
         <w:t>TABLE OF CONTENTS</w:t>
       </w:r>
-      <w:bookmarkEnd w:id="1"/>
+      <w:bookmarkEnd w:id="0"/>
     </w:p>
     <w:p>
       <w:pPr>
@@ -3639,7 +3631,7 @@
         </w:rPr>
         <w:t>DETAIL</w:t>
       </w:r>
-      <w:bookmarkEnd w:id="0"/>
+      <w:bookmarkEnd w:id="1"/>
       <w:bookmarkEnd w:id="2"/>
     </w:p>
     <w:p>
@@ -6176,14 +6168,7 @@
                 <w:sz w:val="18"/>
                 <w:szCs w:val="18"/>
               </w:rPr>
-              <w:t>BR</w:t>
-            </w:r>
-            <w:r>
-              <w:rPr>
-                <w:sz w:val="18"/>
-                <w:szCs w:val="18"/>
-              </w:rPr>
-              <w:t>-##</w:t>
+              <w:t>BR-##</w:t>
             </w:r>
           </w:p>
         </w:tc>
@@ -7668,14 +7653,7 @@
                 <w:b/>
                 <w:bCs/>
               </w:rPr>
-              <w:t>R</w:t>
-            </w:r>
-            <w:r>
-              <w:rPr>
-                <w:b/>
-                <w:bCs/>
-              </w:rPr>
-              <w:t>isk</w:t>
+              <w:t>Risk</w:t>
             </w:r>
           </w:p>
         </w:tc>
@@ -7761,21 +7739,7 @@
                 <w:sz w:val="18"/>
                 <w:szCs w:val="18"/>
               </w:rPr>
-              <w:t>R</w:t>
-            </w:r>
-            <w:r>
-              <w:rPr>
-                <w:sz w:val="18"/>
-                <w:szCs w:val="18"/>
-              </w:rPr>
-              <w:t>K</w:t>
-            </w:r>
-            <w:r>
-              <w:rPr>
-                <w:sz w:val="18"/>
-                <w:szCs w:val="18"/>
-              </w:rPr>
-              <w:t>-##</w:t>
+              <w:t>RK-##</w:t>
             </w:r>
           </w:p>
         </w:tc>
@@ -8015,14 +7979,7 @@
                 <w:sz w:val="18"/>
                 <w:szCs w:val="18"/>
               </w:rPr>
-              <w:t>SC</w:t>
-            </w:r>
-            <w:r>
-              <w:rPr>
-                <w:sz w:val="18"/>
-                <w:szCs w:val="18"/>
-              </w:rPr>
-              <w:t>-##</w:t>
+              <w:t>SC-##</w:t>
             </w:r>
           </w:p>
         </w:tc>
@@ -8543,14 +8500,7 @@
                 <w:sz w:val="18"/>
                 <w:szCs w:val="18"/>
               </w:rPr>
-              <w:t>OQ</w:t>
-            </w:r>
-            <w:r>
-              <w:rPr>
-                <w:sz w:val="18"/>
-                <w:szCs w:val="18"/>
-              </w:rPr>
-              <w:t>-##</w:t>
+              <w:t>OQ-##</w:t>
             </w:r>
           </w:p>
         </w:tc>

</xml_diff>